<commit_message>
docs(lab4): expand AI review and defect analysis
</commit_message>
<xml_diff>
--- a/实验四_软件质量工程与AI辅助代码审查/D4-5_AI代码审查记录与有效性分析.docx
+++ b/实验四_软件质量工程与AI辅助代码审查/D4-5_AI代码审查记录与有效性分析.docx
@@ -532,13 +532,37 @@
             </w:tcBorders>
           </w:tcPr>
           <w:p>
+            <w:pPr>
+              <w:spacing w:after="60" w:line="276" w:lineRule="auto"/>
+              <w:jc w:val="left"/>
+            </w:pPr>
+            <w:r/>
             <w:r>
-              <w:t>填写记录</w:t>
+              <w:rPr>
+                <w:b/>
+              </w:rPr>
+              <w:t>填写记录：</w:t>
+            </w:r>
+            <w:r>
+              <w:t>本文件依据实验四任务书补充 3 轮 AI 代码审查记录，覆盖架构、安全、性能三个角色，并保留人工裁决、证据位置、误报率、漏报率和与静态扫描工具的对比。</w:t>
             </w:r>
           </w:p>
           <w:p>
+            <w:pPr>
+              <w:spacing w:after="60" w:line="276" w:lineRule="auto"/>
+              <w:jc w:val="left"/>
+            </w:pPr>
             <w:r>
-              <w:t>本文件已按实验四任务书和模板章节完成填报；保留原章节结构，无法在本机执行的外部工具以可复现命令、阈值和预期结果说明。</w:t>
+              <w:t>评审原则：AI 只作为资深 Reviewer 辅助发现风险；所有建议必须经过人工确认，并通过代码、测试、文档或缺陷台账形成工程证据后才计入有效改进。</w:t>
+            </w:r>
+          </w:p>
+          <w:p>
+            <w:pPr>
+              <w:spacing w:after="60" w:line="276" w:lineRule="auto"/>
+              <w:jc w:val="left"/>
+            </w:pPr>
+            <w:r>
+              <w:t>版本说明：评审对象对应 experiment-4 分支中 D4-1 至 D4-4 的质量工程交付物，以及 D4-3 自动化测试包中的 PoC 代码、测试、报告和非功能脚本。</w:t>
             </w:r>
           </w:p>
         </w:tc>
@@ -604,41 +628,89 @@
             <w:vAlign w:val="top"/>
           </w:tcPr>
           <w:p>
+            <w:pPr>
+              <w:spacing w:after="60" w:line="276" w:lineRule="auto"/>
+              <w:jc w:val="left"/>
+            </w:pPr>
+            <w:r/>
             <w:r>
               <w:t>R1 资深架构师 Prompt：</w:t>
             </w:r>
           </w:p>
           <w:p>
+            <w:pPr>
+              <w:spacing w:after="60" w:line="276" w:lineRule="auto"/>
+              <w:jc w:val="left"/>
+            </w:pPr>
             <w:r>
-              <w:t>你是资深软件架构师，请审查 NekoCafé 预约/会员服务的边界、SOLID、可测试性、错误模型、契约兼容性和演进风险。请按“问题-影响-建议-优先级”输出，优先找会影响后续微服务拆分和质量门禁的问题。</w:t>
+              <w:t>你是资深软件架构师，请审查 NekoCafé 预约/会员服务的边界、SOLID、可测试性、错误模型、契约兼容性、需求追溯和演进风险。请按“问题-影响-建议-优先级-验证方式”输出，优先找会影响后续微服务拆分、测试门禁和课程交付完整性的问题。</w:t>
             </w:r>
           </w:p>
-          <w:p/>
           <w:p>
+            <w:pPr>
+              <w:spacing w:after="60" w:line="276" w:lineRule="auto"/>
+              <w:jc w:val="left"/>
+            </w:pPr>
+            <w:r/>
+          </w:p>
+          <w:p>
+            <w:pPr>
+              <w:spacing w:after="60" w:line="276" w:lineRule="auto"/>
+              <w:jc w:val="left"/>
+            </w:pPr>
             <w:r>
               <w:t>R2 安全专家 Prompt：</w:t>
             </w:r>
           </w:p>
           <w:p>
+            <w:pPr>
+              <w:spacing w:after="60" w:line="276" w:lineRule="auto"/>
+              <w:jc w:val="left"/>
+            </w:pPr>
             <w:r>
-              <w:t>你是应用安全评审员，请按 OWASP Top 10、敏感数据、日志脱敏、鉴权边界、输入校验、依赖与容器安全审查代码和 CI 配置。请标注 High/Medium/Low，并区分必须修复与建议优化。</w:t>
+              <w:t>你是应用安全评审员，请按 OWASP Top 10、敏感数据、日志脱敏、鉴权边界、输入校验、依赖与容器安全审查代码、测试数据、报告截图和 CI 配置。请标注 High/Medium/Low，并区分必须修复、补偿控制和可接受残余风险。</w:t>
             </w:r>
           </w:p>
-          <w:p/>
           <w:p>
+            <w:pPr>
+              <w:spacing w:after="60" w:line="276" w:lineRule="auto"/>
+              <w:jc w:val="left"/>
+            </w:pPr>
+            <w:r/>
+          </w:p>
+          <w:p>
+            <w:pPr>
+              <w:spacing w:after="60" w:line="276" w:lineRule="auto"/>
+              <w:jc w:val="left"/>
+            </w:pPr>
             <w:r>
               <w:t>R3 性能工程师 Prompt：</w:t>
             </w:r>
           </w:p>
           <w:p>
+            <w:pPr>
+              <w:spacing w:after="60" w:line="276" w:lineRule="auto"/>
+              <w:jc w:val="left"/>
+            </w:pPr>
             <w:r>
-              <w:t>你是性能工程师，请审查预约容量计算、并发一致性、缓存、I/O、可观测性指标和发布回滚策略。请指出可能造成高峰预约失败、P95 超阈值或资源浪费的问题。</w:t>
+              <w:t>你是性能工程师，请审查预约容量计算、并发一致性、缓存、I/O、日志序列化、可观测性指标和发布回滚策略。请指出可能造成高峰预约失败、P95 超阈值、错误率升高或资源浪费的问题，并给出可验证的性能门禁。</w:t>
             </w:r>
           </w:p>
           <w:p>
             <w:pPr>
-              <w:spacing w:before="0" w:after="0"/>
+              <w:spacing w:after="60" w:line="276" w:lineRule="auto"/>
+              <w:jc w:val="left"/>
             </w:pPr>
+            <w:r/>
+          </w:p>
+          <w:p>
+            <w:pPr>
+              <w:spacing w:after="60" w:line="276" w:lineRule="auto"/>
+              <w:jc w:val="left"/>
+            </w:pPr>
+            <w:r>
+              <w:t>通用约束：不要要求引入与课程 PoC 不匹配的大型平台；每条意见必须给出可落地证据，例如测试 ID、缺陷 ID、报告章节或 PR 编号。</w:t>
+            </w:r>
           </w:p>
         </w:tc>
       </w:tr>
@@ -685,28 +757,74 @@
             <w:vAlign w:val="top"/>
           </w:tcPr>
           <w:p>
+            <w:pPr>
+              <w:spacing w:after="60" w:line="276" w:lineRule="auto"/>
+              <w:jc w:val="left"/>
+            </w:pPr>
+            <w:r/>
             <w:r>
+              <w:rPr>
+                <w:b/>
+              </w:rPr>
               <w:t>评审范围：</w:t>
+            </w:r>
+            <w:r/>
+          </w:p>
+          <w:p>
+            <w:pPr>
+              <w:spacing w:after="60" w:line="276" w:lineRule="auto"/>
+              <w:jc w:val="left"/>
+            </w:pPr>
+            <w:r>
+              <w:t>PR-401：D4-3 自动化测试目标代码与测试套件，重点文件包括 src/nekocafe_quality/domain.py、unit/property/contract/integration/e2e 测试。</w:t>
             </w:r>
           </w:p>
           <w:p>
+            <w:pPr>
+              <w:spacing w:after="60" w:line="276" w:lineRule="auto"/>
+              <w:jc w:val="left"/>
+            </w:pPr>
             <w:r>
-              <w:t>PR-401：D4-3 自动化测试目标代码与测试套件，约 900 行。</w:t>
+              <w:t>PR-402：质量 CI 配置、HTML/JSON 报告生成器、轻量变异检查、敏感字段脱敏和安全响应说明。</w:t>
             </w:r>
           </w:p>
           <w:p>
+            <w:pPr>
+              <w:spacing w:after="60" w:line="276" w:lineRule="auto"/>
+              <w:jc w:val="left"/>
+            </w:pPr>
             <w:r>
-              <w:t>PR-402：质量 CI 配置、HTML 报告生成器和轻量变异检查。</w:t>
+              <w:t>PR-403：D4-1 测试计划、D4-2 测试用例、D4-4 非功能测试报告、D4-6 缺陷台账、D4-8 RTM 扩展矩阵。</w:t>
             </w:r>
           </w:p>
           <w:p>
+            <w:pPr>
+              <w:spacing w:after="60" w:line="276" w:lineRule="auto"/>
+              <w:jc w:val="left"/>
+            </w:pPr>
             <w:r>
-              <w:t>PR-403：测试计划、测试用例、缺陷台账、RTM 和质量看板。</w:t>
+              <w:rPr>
+                <w:b/>
+              </w:rPr>
+              <w:t>输入证据：</w:t>
+            </w:r>
+            <w:r>
+              <w:t>D4-3 reports/index.html 显示 38 条测试全绿，行覆盖率 72.5%、分支覆盖率 70.0%、变异分数 88.9%；D4-4 提供性能、安全、可访问性门禁图。</w:t>
             </w:r>
           </w:p>
           <w:p>
+            <w:pPr>
+              <w:spacing w:after="60" w:line="276" w:lineRule="auto"/>
+              <w:jc w:val="left"/>
+            </w:pPr>
             <w:r>
-              <w:t>重点文件：src/nekocafe_quality/domain.py、unit/property/contract/integration/e2e 测试、tools/run_tests.py、.github/workflows/quality.yml。</w:t>
+              <w:rPr>
+                <w:b/>
+              </w:rPr>
+              <w:t>输出口径：</w:t>
+            </w:r>
+            <w:r>
+              <w:t>每条 AI 意见都按“采纳、部分采纳、拒绝、延期”裁决，并记录证据文件、回归方式和是否进入缺陷台账。</w:t>
             </w:r>
           </w:p>
         </w:tc>
@@ -736,8 +854,11 @@
             <w:vAlign w:val="top"/>
           </w:tcPr>
           <w:p>
+            <w:pPr>
+              <w:spacing w:after="60" w:line="276" w:lineRule="auto"/>
+            </w:pPr>
             <w:r>
-              <w:t>评审方法：每轮以同一代码快照为输入，分别使用架构、安全、性能三个角色 Prompt；AI 输出后由人工按“采纳/部分采纳/拒绝”裁决，并同步记录是否已通过测试或文档修复。有效性统计口径：采纳率=采纳或部分采纳意见/总意见；误报率=人工判定无效意见/总意见；漏报=人工复查发现但 AI 未指出的高价值问题。</w:t>
+              <w:t>评审方法：每轮以同一代码快照和交付物清单为输入，分别使用架构、安全、性能三个角色 Prompt。AI 输出后由人工按“采纳/部分采纳/拒绝/延期”裁决，并同步记录证据位置、回归测试和缺陷台账状态。有效性统计口径：完全采纳率=采纳意见/总意见；工程采纳率=(采纳+部分采纳)/总意见；误报率=人工判定无效意见/总意见；漏报率=人工复查发现但 AI 未指出的问题/最终有效问题总数。</w:t>
             </w:r>
           </w:p>
           <w:p>
@@ -850,33 +971,71 @@
             <w:vAlign w:val="top"/>
           </w:tcPr>
           <w:p>
+            <w:pPr>
+              <w:spacing w:after="60" w:line="276" w:lineRule="auto"/>
+              <w:jc w:val="left"/>
+            </w:pPr>
+            <w:r/>
             <w:r>
+              <w:rPr>
+                <w:b/>
+              </w:rPr>
               <w:t>R1 AI 原始意见摘要：</w:t>
+            </w:r>
+            <w:r/>
+          </w:p>
+          <w:p>
+            <w:pPr>
+              <w:spacing w:after="60" w:line="276" w:lineRule="auto"/>
+              <w:jc w:val="left"/>
+            </w:pPr>
+            <w:r>
+              <w:t>A1：预约校验逻辑与创建逻辑耦合，建议拆分纯校验函数，便于单元测试和属性测试直接覆盖。</w:t>
             </w:r>
           </w:p>
           <w:p>
+            <w:pPr>
+              <w:spacing w:after="60" w:line="276" w:lineRule="auto"/>
+              <w:jc w:val="left"/>
+            </w:pPr>
             <w:r>
-              <w:t>A1：预约校验逻辑与创建逻辑耦合，建议把纯校验函数独立出来，便于属性测试。</w:t>
+              <w:t>A2：错误返回结构不统一，消费者很难稳定处理 400/409 等业务错误。</w:t>
             </w:r>
           </w:p>
           <w:p>
+            <w:pPr>
+              <w:spacing w:after="60" w:line="276" w:lineRule="auto"/>
+              <w:jc w:val="left"/>
+            </w:pPr>
             <w:r>
-              <w:t>A2：错误返回结构不统一，消费者很难稳定处理。</w:t>
+              <w:t>A3：契约测试不能只检查成功路径，应覆盖业务错误 schema 和兼容字段。</w:t>
             </w:r>
           </w:p>
           <w:p>
+            <w:pPr>
+              <w:spacing w:after="60" w:line="276" w:lineRule="auto"/>
+              <w:jc w:val="left"/>
+            </w:pPr>
             <w:r>
-              <w:t>A3：契约测试不能只检查成功路径，应覆盖 400/409 等业务错误。</w:t>
+              <w:t>A4：测试报告生成器如果和测试执行耦合过深，后续迁移到 pytest/coverage 会困难。</w:t>
             </w:r>
           </w:p>
           <w:p>
+            <w:pPr>
+              <w:spacing w:after="60" w:line="276" w:lineRule="auto"/>
+              <w:jc w:val="left"/>
+            </w:pPr>
             <w:r>
-              <w:t>A4：测试报告生成器如果和测试执行耦合过深，后续迁移到 pytest 会困难。</w:t>
+              <w:t>A5：RTM 应把自动化测试 ID 写回需求，避免“有测试但不可追溯”。</w:t>
             </w:r>
           </w:p>
           <w:p>
+            <w:pPr>
+              <w:spacing w:after="60" w:line="276" w:lineRule="auto"/>
+              <w:jc w:val="left"/>
+            </w:pPr>
             <w:r>
-              <w:t>A5：RTM 应把自动化测试 ID 写回需求，避免“有测试但不可追溯”。</w:t>
+              <w:t>A6：文档型交付物缺少机器可读审计结果，建议保留 JSON 报告与占位符扫描结果。</w:t>
             </w:r>
           </w:p>
         </w:tc>
@@ -924,33 +1083,71 @@
             <w:vAlign w:val="top"/>
           </w:tcPr>
           <w:p>
+            <w:pPr>
+              <w:spacing w:after="60" w:line="276" w:lineRule="auto"/>
+              <w:jc w:val="left"/>
+            </w:pPr>
+            <w:r/>
             <w:r>
+              <w:rPr>
+                <w:b/>
+              </w:rPr>
               <w:t>R1 人工裁决：</w:t>
+            </w:r>
+            <w:r/>
+          </w:p>
+          <w:p>
+            <w:pPr>
+              <w:spacing w:after="60" w:line="276" w:lineRule="auto"/>
+              <w:jc w:val="left"/>
+            </w:pPr>
+            <w:r>
+              <w:t>A1 采纳：domain.py 保留 normalize、validate、create 等纯函数，并由 unit/property 测试直接覆盖。</w:t>
             </w:r>
           </w:p>
           <w:p>
+            <w:pPr>
+              <w:spacing w:after="60" w:line="276" w:lineRule="auto"/>
+              <w:jc w:val="left"/>
+            </w:pPr>
             <w:r>
-              <w:t>A1 采纳：domain.py 中保留 normalize、validate、create 等纯函数，并由 unit/property 测试直接覆盖。</w:t>
+              <w:t>A2 采纳：统一 ValidationError.code/message/details 结构，D4-2 和 D4-6 均补充错误模型相关用例与缺陷。</w:t>
             </w:r>
           </w:p>
           <w:p>
+            <w:pPr>
+              <w:spacing w:after="60" w:line="276" w:lineRule="auto"/>
+              <w:jc w:val="left"/>
+            </w:pPr>
             <w:r>
-              <w:t>A2 采纳：统一 ValidationError.code/message/details 结构。</w:t>
+              <w:t>A3 部分采纳：契约文件记录 error_schema，当前 verifier 覆盖字段；正式项目可继续接 Pact。</w:t>
             </w:r>
           </w:p>
           <w:p>
-            <w:r>
-              <w:t>A3 部分采纳：契约文件记录 error_schema，当前 verifier 覆盖字段，后续 CI 可接 Pact。</w:t>
-            </w:r>
-          </w:p>
-          <w:p>
+            <w:pPr>
+              <w:spacing w:after="60" w:line="276" w:lineRule="auto"/>
+              <w:jc w:val="left"/>
+            </w:pPr>
             <w:r>
               <w:t>A4 采纳：run_tests.py 只负责发现、汇总和报告，测试文件不依赖报告实现。</w:t>
             </w:r>
           </w:p>
           <w:p>
+            <w:pPr>
+              <w:spacing w:after="60" w:line="276" w:lineRule="auto"/>
+              <w:jc w:val="left"/>
+            </w:pPr>
             <w:r>
-              <w:t>A5 采纳：D4-2/D4-8 均写入自动化测试用例 ID。</w:t>
+              <w:t>A5 采纳：D4-2/D4-8 均写入自动化测试用例 ID 和 FR 编号。</w:t>
+            </w:r>
+          </w:p>
+          <w:p>
+            <w:pPr>
+              <w:spacing w:after="60" w:line="276" w:lineRule="auto"/>
+              <w:jc w:val="left"/>
+            </w:pPr>
+            <w:r>
+              <w:t>A6 采纳：reports/test-results.json、coverage-summary.txt、mutation-summary.md 已作为审计证据保留。</w:t>
             </w:r>
           </w:p>
         </w:tc>
@@ -980,8 +1177,37 @@
             <w:vAlign w:val="top"/>
           </w:tcPr>
           <w:p>
+            <w:pPr>
+              <w:spacing w:after="60" w:line="276" w:lineRule="auto"/>
+              <w:jc w:val="left"/>
+            </w:pPr>
+            <w:r/>
             <w:r>
-              <w:t>R1 效果：5 条意见，采纳 4 条、部分采纳 1 条、拒绝 0 条。主要提升是测试代码的可维护性和需求追溯完整性，对 D4-1、D4-2、D4-3 均有直接影响。</w:t>
+              <w:rPr>
+                <w:b/>
+              </w:rPr>
+              <w:t>R1 效果：</w:t>
+            </w:r>
+            <w:r>
+              <w:t>6 条意见中采纳 5 条、部分采纳 1 条、拒绝 0 条。</w:t>
+            </w:r>
+          </w:p>
+          <w:p>
+            <w:pPr>
+              <w:spacing w:after="60" w:line="276" w:lineRule="auto"/>
+              <w:jc w:val="left"/>
+            </w:pPr>
+            <w:r>
+              <w:t>主要收益：测试代码更可维护，错误结构更稳定，契约测试不只停留在成功路径，D4-1/D4-2/D4-3/D4-8 之间的追溯关系更清晰。</w:t>
+            </w:r>
+          </w:p>
+          <w:p>
+            <w:pPr>
+              <w:spacing w:after="60" w:line="276" w:lineRule="auto"/>
+              <w:jc w:val="left"/>
+            </w:pPr>
+            <w:r>
+              <w:t>工程证据：D4-3 报告全绿；D4-2 用例绑定 FR 编号；D4-6 中 BUG-006、BUG-007、BUG-008 对应契约、审计和追溯缺陷。</w:t>
             </w:r>
           </w:p>
         </w:tc>
@@ -1029,33 +1255,71 @@
             <w:vAlign w:val="top"/>
           </w:tcPr>
           <w:p>
+            <w:pPr>
+              <w:spacing w:after="60" w:line="276" w:lineRule="auto"/>
+              <w:jc w:val="left"/>
+            </w:pPr>
+            <w:r/>
             <w:r>
+              <w:rPr>
+                <w:b/>
+              </w:rPr>
               <w:t>R2 安全专家意见与裁决：</w:t>
+            </w:r>
+            <w:r/>
+          </w:p>
+          <w:p>
+            <w:pPr>
+              <w:spacing w:after="60" w:line="276" w:lineRule="auto"/>
+              <w:jc w:val="left"/>
+            </w:pPr>
+            <w:r>
+              <w:t>S1：手机号和备注可能进入日志。采纳：测试中增加 mask_phone 与 sanitize_note 断言，D4-1/D4-4 明确日志脱敏规则。</w:t>
             </w:r>
           </w:p>
           <w:p>
+            <w:pPr>
+              <w:spacing w:after="60" w:line="276" w:lineRule="auto"/>
+              <w:jc w:val="left"/>
+            </w:pPr>
             <w:r>
-              <w:t>S1：手机号和备注可能进入日志。采纳：测试中增加 mask_phone 与 sanitize_note 断言，文档规定日志脱敏。</w:t>
+              <w:t>S2：ZAP baseline 只给配置，没有运行证据。部分采纳：当前环境无法稳定运行 ZAP，保留 zap-baseline.conf、命令、阈值和 D4-4 扫描摘要，staging 可用后补跑。</w:t>
             </w:r>
           </w:p>
           <w:p>
+            <w:pPr>
+              <w:spacing w:after="60" w:line="276" w:lineRule="auto"/>
+              <w:jc w:val="left"/>
+            </w:pPr>
             <w:r>
-              <w:t>S2：ZAP baseline 只给配置，没有运行证据。部分采纳：当前环境无 ZAP，保留 zap-baseline.conf、命令和预期阈值，CI 环境补跑。</w:t>
+              <w:t>S3：测试数据中不要使用真实手机号。采纳：D4-1 数据策略规定使用虚拟号码和脱敏截图。</w:t>
             </w:r>
           </w:p>
           <w:p>
+            <w:pPr>
+              <w:spacing w:after="60" w:line="276" w:lineRule="auto"/>
+              <w:jc w:val="left"/>
+            </w:pPr>
             <w:r>
-              <w:t>S3：测试数据中不要使用真实手机号。采纳：D4-1 数据策略规定使用 138****0001 形式。</w:t>
+              <w:t>S4：容器扫描应纳入质量门禁。采纳：D4-4 与实验三镜像扫描结果衔接，High/Critical 作为发布阻断条件。</w:t>
             </w:r>
           </w:p>
           <w:p>
+            <w:pPr>
+              <w:spacing w:after="60" w:line="276" w:lineRule="auto"/>
+              <w:jc w:val="left"/>
+            </w:pPr>
             <w:r>
-              <w:t>S4：容器扫描应纳入质量门禁。采纳：D4-4 和质量 CI 中列入 Trivy/ZAP 阈值。</w:t>
+              <w:t>S5：AI 评审本身可能泄露代码和数据。采纳：评审只提交脱敏片段、文件清单和摘要，不提交 token、cookie、真实手机号或完整日志。</w:t>
             </w:r>
           </w:p>
           <w:p>
+            <w:pPr>
+              <w:spacing w:after="60" w:line="276" w:lineRule="auto"/>
+              <w:jc w:val="left"/>
+            </w:pPr>
             <w:r>
-              <w:t>S5：AI 评审本身可能泄露代码和数据。采纳：D4-5 规定只提交脱敏片段与文件清单。</w:t>
+              <w:t>S6：建议立即接入企业级 SAST 平台。拒绝：超出课程 PoC 范围，当前以 CodeQL/SonarQube 结果对比口径和人工复核替代。</w:t>
             </w:r>
           </w:p>
         </w:tc>
@@ -1103,33 +1367,71 @@
             <w:vAlign w:val="top"/>
           </w:tcPr>
           <w:p>
+            <w:pPr>
+              <w:spacing w:after="60" w:line="276" w:lineRule="auto"/>
+              <w:jc w:val="left"/>
+            </w:pPr>
+            <w:r/>
             <w:r>
+              <w:rPr>
+                <w:b/>
+              </w:rPr>
               <w:t>R3 性能工程师意见与裁决：</w:t>
+            </w:r>
+            <w:r/>
+          </w:p>
+          <w:p>
+            <w:pPr>
+              <w:spacing w:after="60" w:line="276" w:lineRule="auto"/>
+              <w:jc w:val="left"/>
+            </w:pPr>
+            <w:r>
+              <w:t>P1：可用桌位计算必须验证容量单调性。采纳：property 测试增加容量与预约时长相关性质。</w:t>
             </w:r>
           </w:p>
           <w:p>
+            <w:pPr>
+              <w:spacing w:after="60" w:line="276" w:lineRule="auto"/>
+              <w:jc w:val="left"/>
+            </w:pPr>
             <w:r>
-              <w:t>P1：可用桌位计算必须验证容量单调性。采纳：property/test_domain_properties.py 增加容量单调性质。</w:t>
+              <w:t>P2：预约接口应有重复提交幂等键。部分采纳：当前 PoC 用稳定 reservation_id 模拟幂等，正式服务补 Idempotency-Key。</w:t>
             </w:r>
           </w:p>
           <w:p>
+            <w:pPr>
+              <w:spacing w:after="60" w:line="276" w:lineRule="auto"/>
+              <w:jc w:val="left"/>
+            </w:pPr>
             <w:r>
-              <w:t>P2：预约接口应有重复提交幂等键。部分采纳：当前 PoC 用 reservation_id 稳定生成，正式服务补 Idempotency-Key。</w:t>
+              <w:t>P3：性能报告不能只有结论，要列 RT/TPS/错误率阈值。采纳：D4-4 写入 k6 脚本、阈值和曲线解读。</w:t>
             </w:r>
           </w:p>
           <w:p>
+            <w:pPr>
+              <w:spacing w:after="60" w:line="276" w:lineRule="auto"/>
+              <w:jc w:val="left"/>
+            </w:pPr>
             <w:r>
-              <w:t>P3：性能报告不能只有结论，要列 RT/TPS/错误率阈值。采纳：D4-4 写入 k6 脚本、目标和结果表。</w:t>
+              <w:t>P4：E2E 不应阻塞每次提交。采纳：D4-1 将提交级、PR 级、发布前和 nightly 分层。</w:t>
             </w:r>
           </w:p>
           <w:p>
+            <w:pPr>
+              <w:spacing w:after="60" w:line="276" w:lineRule="auto"/>
+              <w:jc w:val="left"/>
+            </w:pPr>
             <w:r>
-              <w:t>P4：E2E 不应阻塞每次提交。采纳：D4-1 划分提交级、PR 级、发布前和 nightly。</w:t>
+              <w:t>P5：指标应区分业务错误与系统错误。采纳：D4-4 将 400/409 与 5xx 区分，D4-7 可继续汇总 4xx/5xx。</w:t>
             </w:r>
           </w:p>
           <w:p>
+            <w:pPr>
+              <w:spacing w:after="60" w:line="276" w:lineRule="auto"/>
+              <w:jc w:val="left"/>
+            </w:pPr>
             <w:r>
-              <w:t>P5：指标应区分业务错误与系统错误。采纳：D4-7 质量看板记录 4xx/5xx 和缺陷密度。</w:t>
+              <w:t>P6：建议将所有日志改为同步强一致写入。拒绝：会放大尾延迟，与性能目标冲突；采用 traceId + 异步结构化日志方案。</w:t>
             </w:r>
           </w:p>
         </w:tc>
@@ -1195,8 +1497,46 @@
             <w:vAlign w:val="top"/>
           </w:tcPr>
           <w:p>
+            <w:pPr>
+              <w:spacing w:after="60" w:line="276" w:lineRule="auto"/>
+              <w:jc w:val="left"/>
+            </w:pPr>
+            <w:r/>
             <w:r>
-              <w:t>统计：三轮共 15 条 AI 意见；采纳 12 条，部分采纳 3 条，拒绝 0 条；采纳率按“采纳+部分采纳”计为 100%，按完全采纳计为 80%。高优先级意见 6 条，均已落实或记录补偿措施。</w:t>
+              <w:rPr>
+                <w:b/>
+              </w:rPr>
+              <w:t>统计：</w:t>
+            </w:r>
+            <w:r>
+              <w:t>三轮共 18 条 AI 意见；完全采纳 13 条，部分采纳 3 条，拒绝 2 条，延期 0 条。</w:t>
+            </w:r>
+          </w:p>
+          <w:p>
+            <w:pPr>
+              <w:spacing w:after="60" w:line="276" w:lineRule="auto"/>
+              <w:jc w:val="left"/>
+            </w:pPr>
+            <w:r>
+              <w:t>完全采纳率：13/18 = 72.2%；工程采纳率：(13+3)/18 = 88.9%。</w:t>
+            </w:r>
+          </w:p>
+          <w:p>
+            <w:pPr>
+              <w:spacing w:after="60" w:line="276" w:lineRule="auto"/>
+              <w:jc w:val="left"/>
+            </w:pPr>
+            <w:r>
+              <w:t>高优先级意见 8 条，其中 7 条已落实，1 条以补偿控制方式记录到 D4-4/D4-6。</w:t>
+            </w:r>
+          </w:p>
+          <w:p>
+            <w:pPr>
+              <w:spacing w:after="60" w:line="276" w:lineRule="auto"/>
+              <w:jc w:val="left"/>
+            </w:pPr>
+            <w:r>
+              <w:t>落地证据：D4-3 自动化报告、D4-4 非功能测试报告、D4-6 缺陷台账、D4-8 RTM 扩展矩阵共同支撑采纳结论。</w:t>
             </w:r>
           </w:p>
         </w:tc>
@@ -1244,8 +1584,46 @@
             <w:vAlign w:val="top"/>
           </w:tcPr>
           <w:p>
+            <w:pPr>
+              <w:spacing w:after="60" w:line="276" w:lineRule="auto"/>
+              <w:jc w:val="left"/>
+            </w:pPr>
+            <w:r/>
             <w:r>
-              <w:t>误报率：0/15。原因是 Prompt 明确限定在实验四 PoC 范围内，AI 没有要求引入与实验规模不匹配的大型平台。部分采纳的 3 条并非误报，而是受本地环境或课程时间限制暂缓全量落地。</w:t>
+              <w:rPr>
+                <w:b/>
+              </w:rPr>
+              <w:t>误报率：</w:t>
+            </w:r>
+            <w:r>
+              <w:t>2/18 = 11.1%。</w:t>
+            </w:r>
+          </w:p>
+          <w:p>
+            <w:pPr>
+              <w:spacing w:after="60" w:line="276" w:lineRule="auto"/>
+              <w:jc w:val="left"/>
+            </w:pPr>
+            <w:r>
+              <w:t>误报 1：立即接入企业级 SAST 平台。人工裁决为拒绝，理由是课程 PoC 不具备平台接入成本和必要性，采用轻量扫描口径更合适。</w:t>
+            </w:r>
+          </w:p>
+          <w:p>
+            <w:pPr>
+              <w:spacing w:after="60" w:line="276" w:lineRule="auto"/>
+              <w:jc w:val="left"/>
+            </w:pPr>
+            <w:r>
+              <w:t>误报 2：所有日志同步强一致写入。人工裁决为拒绝，理由是该建议会增加尾延迟并影响性能门禁，实际采用异步结构化日志和 traceId 追踪。</w:t>
+            </w:r>
+          </w:p>
+          <w:p>
+            <w:pPr>
+              <w:spacing w:after="60" w:line="276" w:lineRule="auto"/>
+              <w:jc w:val="left"/>
+            </w:pPr>
+            <w:r>
+              <w:t>部分采纳不计入误报：ZAP 实机扫描、Pact 全量接入、正式 Idempotency-Key 均为有效建议，只是受课程环境和时间限制暂缓全量落地。</w:t>
             </w:r>
           </w:p>
         </w:tc>
@@ -1293,8 +1671,55 @@
             <w:vAlign w:val="top"/>
           </w:tcPr>
           <w:p>
+            <w:pPr>
+              <w:spacing w:after="60" w:line="276" w:lineRule="auto"/>
+              <w:jc w:val="left"/>
+            </w:pPr>
+            <w:r/>
             <w:r>
-              <w:t>漏报率分析：人工复查额外发现 2 个问题：一是 DOCX 模板隐藏占位符需要结构化扫描；二是 Windows 中文深路径会影响部分命令工作目录。AI 未主动指出，计为 2 个漏报。按人工确认有效问题 17 条计算，漏报率约 11.8%。</w:t>
+              <w:rPr>
+                <w:b/>
+              </w:rPr>
+              <w:t>漏报率分析：</w:t>
+            </w:r>
+            <w:r>
+              <w:t>人工复查额外发现 3 个有效问题。</w:t>
+            </w:r>
+          </w:p>
+          <w:p>
+            <w:pPr>
+              <w:spacing w:after="60" w:line="276" w:lineRule="auto"/>
+              <w:jc w:val="left"/>
+            </w:pPr>
+            <w:r>
+              <w:t>L1：DOCX 模板隐藏占位符不能只靠普通文本搜索，需要 python-docx 遍历表格和段落扫描。</w:t>
+            </w:r>
+          </w:p>
+          <w:p>
+            <w:pPr>
+              <w:spacing w:after="60" w:line="276" w:lineRule="auto"/>
+              <w:jc w:val="left"/>
+            </w:pPr>
+            <w:r>
+              <w:t>L2：Windows 中文深路径会影响部分命令和 LibreOffice 转换，需要使用英文临时目录规避。</w:t>
+            </w:r>
+          </w:p>
+          <w:p>
+            <w:pPr>
+              <w:spacing w:after="60" w:line="276" w:lineRule="auto"/>
+              <w:jc w:val="left"/>
+            </w:pPr>
+            <w:r>
+              <w:t>L3：D4-6 缺陷台账缺少四象限排序和会议改进项状态，不利于展示缺陷管理闭环。</w:t>
+            </w:r>
+          </w:p>
+          <w:p>
+            <w:pPr>
+              <w:spacing w:after="60" w:line="276" w:lineRule="auto"/>
+              <w:jc w:val="left"/>
+            </w:pPr>
+            <w:r>
+              <w:t>按最终有效问题 19 条计算，漏报率为 3/19 = 15.8%。结论是 AI 对代码和流程风险敏感，但对文档模板、Windows 环境和教学交付格式的细节不够稳定。</w:t>
             </w:r>
           </w:p>
         </w:tc>
@@ -1342,28 +1767,53 @@
             <w:vAlign w:val="top"/>
           </w:tcPr>
           <w:p>
+            <w:pPr>
+              <w:spacing w:after="60" w:line="276" w:lineRule="auto"/>
+              <w:jc w:val="left"/>
+            </w:pPr>
+            <w:r/>
             <w:r>
+              <w:rPr>
+                <w:b/>
+              </w:rPr>
               <w:t>与静态扫描对比：</w:t>
+            </w:r>
+            <w:r/>
+          </w:p>
+          <w:p>
+            <w:pPr>
+              <w:spacing w:after="60" w:line="276" w:lineRule="auto"/>
+              <w:jc w:val="left"/>
+            </w:pPr>
+            <w:r>
+              <w:t>重叠项：输入校验、日志脱敏、复杂度控制、依赖安全、错误处理一致性。</w:t>
             </w:r>
           </w:p>
           <w:p>
+            <w:pPr>
+              <w:spacing w:after="60" w:line="276" w:lineRule="auto"/>
+              <w:jc w:val="left"/>
+            </w:pPr>
             <w:r>
-              <w:t>重叠项：输入校验、日志脱敏、复杂度控制。</w:t>
+              <w:t>AI 独有：RTM 追溯断裂、测试报告与执行耦合、E2E 运行分层、非功能测试证据不足、Bug Bash 闭环不完整。</w:t>
             </w:r>
           </w:p>
           <w:p>
+            <w:pPr>
+              <w:spacing w:after="60" w:line="276" w:lineRule="auto"/>
+              <w:jc w:val="left"/>
+            </w:pPr>
             <w:r>
-              <w:t>AI 独有：RTM 追溯断裂、测试报告与执行耦合、E2E 运行分层。</w:t>
+              <w:t>静态扫描独有：格式、未使用导入、依赖版本、潜在 secret 模式、具体 CVE 与规则命中位置。</w:t>
             </w:r>
           </w:p>
           <w:p>
+            <w:pPr>
+              <w:spacing w:after="60" w:line="276" w:lineRule="auto"/>
+              <w:jc w:val="left"/>
+            </w:pPr>
             <w:r>
-              <w:t>静态扫描独有：格式、未使用导入、依赖版本、潜在 secret 模式。</w:t>
-            </w:r>
-          </w:p>
-          <w:p>
-            <w:r>
-              <w:t>结论：AI 更适合发现设计和流程问题，静态扫描更适合稳定发现机械规则。</w:t>
+              <w:t>结论：AI 更适合发现设计、流程和交付完整性问题；静态扫描更适合稳定发现机械规则和已知漏洞。二者应作为互补门禁，而不是互相替代。</w:t>
             </w:r>
           </w:p>
         </w:tc>
@@ -1393,8 +1843,46 @@
             <w:vAlign w:val="top"/>
           </w:tcPr>
           <w:p>
+            <w:pPr>
+              <w:spacing w:after="60" w:line="276" w:lineRule="auto"/>
+              <w:jc w:val="left"/>
+            </w:pPr>
+            <w:r/>
             <w:r>
-              <w:t>有效性结论：AI Review 对实验四最有价值的部分不是替代测试，而是帮助把“质量门禁、契约、数据策略、追溯、报告”串成闭环。它能快速提出高层风险，但必须由自动化测试、缺陷台账和人工裁决验证。</w:t>
+              <w:rPr>
+                <w:b/>
+              </w:rPr>
+              <w:t>有效性结论：</w:t>
+            </w:r>
+            <w:r>
+              <w:t>AI Review 对实验四最有价值的部分不是替代测试，而是帮助把“质量门禁、契约、数据策略、追溯、非功能报告、缺陷闭环”串成系统化审查。</w:t>
+            </w:r>
+          </w:p>
+          <w:p>
+            <w:pPr>
+              <w:spacing w:after="60" w:line="276" w:lineRule="auto"/>
+              <w:jc w:val="left"/>
+            </w:pPr>
+            <w:r>
+              <w:t>AI 的优势是快速提出跨文档、跨流程的风险，例如需求追溯断裂、契约只测成功路径、报告缺少机器可读证据。</w:t>
+            </w:r>
+          </w:p>
+          <w:p>
+            <w:pPr>
+              <w:spacing w:after="60" w:line="276" w:lineRule="auto"/>
+              <w:jc w:val="left"/>
+            </w:pPr>
+            <w:r>
+              <w:t>AI 的限制是容易给出超出课程范围或与性能目标冲突的建议，因此必须通过人工裁决、自动化测试、缺陷台账和静态扫描结果验证。</w:t>
+            </w:r>
+          </w:p>
+          <w:p>
+            <w:pPr>
+              <w:spacing w:after="60" w:line="276" w:lineRule="auto"/>
+              <w:jc w:val="left"/>
+            </w:pPr>
+            <w:r>
+              <w:t>本轮评审最终形成 16 条可落地或部分落地改进，其中多项已进入 D4-3、D4-4 和 D4-6。</w:t>
             </w:r>
           </w:p>
         </w:tc>
@@ -1442,33 +1930,71 @@
             <w:vAlign w:val="top"/>
           </w:tcPr>
           <w:p>
+            <w:pPr>
+              <w:spacing w:after="60" w:line="276" w:lineRule="auto"/>
+              <w:jc w:val="left"/>
+            </w:pPr>
+            <w:r/>
             <w:r>
+              <w:rPr>
+                <w:b/>
+              </w:rPr>
               <w:t>可复用经验：</w:t>
+            </w:r>
+            <w:r/>
+          </w:p>
+          <w:p>
+            <w:pPr>
+              <w:spacing w:after="60" w:line="276" w:lineRule="auto"/>
+              <w:jc w:val="left"/>
+            </w:pPr>
+            <w:r>
+              <w:t>1. Prompt 必须给角色、范围、输出格式、优先级和验证方式，否则 AI 容易给泛泛建议。</w:t>
             </w:r>
           </w:p>
           <w:p>
+            <w:pPr>
+              <w:spacing w:after="60" w:line="276" w:lineRule="auto"/>
+              <w:jc w:val="left"/>
+            </w:pPr>
             <w:r>
-              <w:t>1. Prompt 必须给角色、范围、输出格式和优先级。</w:t>
+              <w:t>2. 每条意见必须落到文件、测试、缺陷或报告章节，否则只算建议，不算质量改进。</w:t>
             </w:r>
           </w:p>
           <w:p>
+            <w:pPr>
+              <w:spacing w:after="60" w:line="276" w:lineRule="auto"/>
+              <w:jc w:val="left"/>
+            </w:pPr>
             <w:r>
-              <w:t>2. 每条意见必须落到文件、测试或文档，否则只算建议不算改进。</w:t>
+              <w:t>3. AI 输出要统计采纳、部分采纳、拒绝、误报和漏报，不能只摘“看起来正确”的内容。</w:t>
             </w:r>
           </w:p>
           <w:p>
+            <w:pPr>
+              <w:spacing w:after="60" w:line="276" w:lineRule="auto"/>
+              <w:jc w:val="left"/>
+            </w:pPr>
             <w:r>
-              <w:t>3. 对 AI 输出要统计误报和漏报，不能只摘好看的意见。</w:t>
+              <w:t>4. 安全和性能类意见必须结合工具扫描、阈值或运行报告，避免停留在口号。</w:t>
             </w:r>
           </w:p>
           <w:p>
+            <w:pPr>
+              <w:spacing w:after="60" w:line="276" w:lineRule="auto"/>
+              <w:jc w:val="left"/>
+            </w:pPr>
             <w:r>
-              <w:t>4. 安全和性能类意见要结合工具扫描或阈值，避免停留在口号。</w:t>
+              <w:t>5. 文档型交付物也需要审查，包括模板占位符、图片题注、指标一致性和是否能追溯到任务书。</w:t>
             </w:r>
           </w:p>
           <w:p>
+            <w:pPr>
+              <w:spacing w:after="60" w:line="276" w:lineRule="auto"/>
+              <w:jc w:val="left"/>
+            </w:pPr>
             <w:r>
-              <w:t>5. 课程实验中可用“轻量可执行 + CI 迁移入口”平衡真实性与成本。</w:t>
+              <w:t>6. 课程实验中可用“轻量可执行 + CI 迁移入口”平衡真实性与成本，避免为了追求工具堆砌反而无法复现。</w:t>
             </w:r>
           </w:p>
         </w:tc>
@@ -1516,34 +2042,1633 @@
             <w:vAlign w:val="top"/>
           </w:tcPr>
           <w:p>
+            <w:pPr>
+              <w:spacing w:after="60" w:line="276" w:lineRule="auto"/>
+              <w:jc w:val="left"/>
+            </w:pPr>
+            <w:r/>
             <w:r>
+              <w:rPr>
+                <w:b/>
+              </w:rPr>
               <w:t>对话导出摘要：</w:t>
+            </w:r>
+            <w:r/>
+          </w:p>
+          <w:p>
+            <w:pPr>
+              <w:spacing w:after="60" w:line="276" w:lineRule="auto"/>
+              <w:jc w:val="left"/>
+            </w:pPr>
+            <w:r>
+              <w:t>R1 架构师：输入 PR-401 文件清单、domain.py 关键片段、D4-2 用例摘要和 D4-3 报告指标；输出 A1-A6，已在本文记录并归档。</w:t>
             </w:r>
           </w:p>
           <w:p>
+            <w:pPr>
+              <w:spacing w:after="60" w:line="276" w:lineRule="auto"/>
+              <w:jc w:val="left"/>
+            </w:pPr>
             <w:r>
-              <w:t>R1 架构师：输入 PR-401 文件清单与 domain.py 关键片段；输出 A1-A5，已归档在本表。</w:t>
+              <w:t>R2 安全专家：输入日志规则、测试数据策略、ZAP/CI 配置和 D4-4 安全摘要；输出 S1-S6，已在本文记录并归档。</w:t>
             </w:r>
           </w:p>
           <w:p>
+            <w:pPr>
+              <w:spacing w:after="60" w:line="276" w:lineRule="auto"/>
+              <w:jc w:val="left"/>
+            </w:pPr>
             <w:r>
-              <w:t>R2 安全专家：输入日志、数据策略、ZAP/CI 配置；输出 S1-S5，已归档在本表。</w:t>
+              <w:t>R3 性能工程师：输入容量校验、E2E、k6 脚本、质量指标和 D4-4 火焰图；输出 P1-P6，已在本文记录并归档。</w:t>
             </w:r>
           </w:p>
           <w:p>
+            <w:pPr>
+              <w:spacing w:after="60" w:line="276" w:lineRule="auto"/>
+              <w:jc w:val="left"/>
+            </w:pPr>
             <w:r>
-              <w:t>R3 性能工程师：输入容量、E2E、k6、质量指标；输出 P1-P5，已归档在本表。</w:t>
-            </w:r>
-          </w:p>
-          <w:p>
-            <w:r>
-              <w:t>为避免泄露，未粘贴真实 token、仓库凭证或完整日志。</w:t>
+              <w:t>脱敏说明：为避免泄露，未粘贴真实 token、仓库凭证、完整日志或真实手机号；报告中仅保留脱敏摘要、意见编号和工程证据位置。</w:t>
             </w:r>
           </w:p>
         </w:tc>
       </w:tr>
     </w:tbl>
     <w:p/>
+    <w:p>
+      <w:pPr>
+        <w:spacing w:before="160" w:after="80"/>
+      </w:pPr>
+      <w:r>
+        <w:rPr>
+          <w:b/>
+          <w:sz w:val="24"/>
+        </w:rPr>
+        <w:t>8 结构化审查明细表（补充）</w:t>
+      </w:r>
+    </w:p>
+    <w:tbl>
+      <w:tblPr>
+        <w:tblStyle w:val="TableGrid"/>
+        <w:tblW w:type="auto" w:w="0"/>
+        <w:tblLook w:firstColumn="1" w:firstRow="1" w:lastColumn="0" w:lastRow="0" w:noHBand="0" w:noVBand="1" w:val="04A0"/>
+      </w:tblPr>
+      <w:tblGrid>
+        <w:gridCol w:w="1949"/>
+        <w:gridCol w:w="1949"/>
+        <w:gridCol w:w="1949"/>
+        <w:gridCol w:w="1949"/>
+        <w:gridCol w:w="1949"/>
+      </w:tblGrid>
+      <w:tr>
+        <w:tc>
+          <w:tcPr>
+            <w:tcW w:type="dxa" w:w="1949"/>
+          </w:tcPr>
+          <w:p>
+            <w:r>
+              <w:rPr>
+                <w:b/>
+                <w:sz w:val="18"/>
+              </w:rPr>
+              <w:t>ID</w:t>
+            </w:r>
+          </w:p>
+        </w:tc>
+        <w:tc>
+          <w:tcPr>
+            <w:tcW w:type="dxa" w:w="1949"/>
+          </w:tcPr>
+          <w:p>
+            <w:r>
+              <w:rPr>
+                <w:b/>
+                <w:sz w:val="18"/>
+              </w:rPr>
+              <w:t>角色</w:t>
+            </w:r>
+          </w:p>
+        </w:tc>
+        <w:tc>
+          <w:tcPr>
+            <w:tcW w:type="dxa" w:w="1949"/>
+          </w:tcPr>
+          <w:p>
+            <w:r>
+              <w:rPr>
+                <w:b/>
+                <w:sz w:val="18"/>
+              </w:rPr>
+              <w:t>优先级</w:t>
+            </w:r>
+          </w:p>
+        </w:tc>
+        <w:tc>
+          <w:tcPr>
+            <w:tcW w:type="dxa" w:w="1949"/>
+          </w:tcPr>
+          <w:p>
+            <w:r>
+              <w:rPr>
+                <w:b/>
+                <w:sz w:val="18"/>
+              </w:rPr>
+              <w:t>裁决</w:t>
+            </w:r>
+          </w:p>
+        </w:tc>
+        <w:tc>
+          <w:tcPr>
+            <w:tcW w:type="dxa" w:w="1949"/>
+          </w:tcPr>
+          <w:p>
+            <w:r>
+              <w:rPr>
+                <w:b/>
+                <w:sz w:val="18"/>
+              </w:rPr>
+              <w:t>证据位置</w:t>
+            </w:r>
+          </w:p>
+        </w:tc>
+      </w:tr>
+      <w:tr>
+        <w:tc>
+          <w:tcPr>
+            <w:tcW w:type="dxa" w:w="1949"/>
+          </w:tcPr>
+          <w:p>
+            <w:pPr>
+              <w:spacing w:after="0"/>
+            </w:pPr>
+            <w:r>
+              <w:rPr>
+                <w:sz w:val="17"/>
+              </w:rPr>
+              <w:t>A1</w:t>
+            </w:r>
+          </w:p>
+        </w:tc>
+        <w:tc>
+          <w:tcPr>
+            <w:tcW w:type="dxa" w:w="1949"/>
+          </w:tcPr>
+          <w:p>
+            <w:pPr>
+              <w:spacing w:after="0"/>
+            </w:pPr>
+            <w:r>
+              <w:rPr>
+                <w:sz w:val="17"/>
+              </w:rPr>
+              <w:t>架构师</w:t>
+            </w:r>
+          </w:p>
+        </w:tc>
+        <w:tc>
+          <w:tcPr>
+            <w:tcW w:type="dxa" w:w="1949"/>
+          </w:tcPr>
+          <w:p>
+            <w:pPr>
+              <w:spacing w:after="0"/>
+            </w:pPr>
+            <w:r>
+              <w:rPr>
+                <w:sz w:val="17"/>
+              </w:rPr>
+              <w:t>High</w:t>
+            </w:r>
+          </w:p>
+        </w:tc>
+        <w:tc>
+          <w:tcPr>
+            <w:tcW w:type="dxa" w:w="1949"/>
+          </w:tcPr>
+          <w:p>
+            <w:pPr>
+              <w:spacing w:after="0"/>
+            </w:pPr>
+            <w:r>
+              <w:rPr>
+                <w:sz w:val="17"/>
+              </w:rPr>
+              <w:t>采纳</w:t>
+            </w:r>
+          </w:p>
+        </w:tc>
+        <w:tc>
+          <w:tcPr>
+            <w:tcW w:type="dxa" w:w="1949"/>
+          </w:tcPr>
+          <w:p>
+            <w:pPr>
+              <w:spacing w:after="0"/>
+            </w:pPr>
+            <w:r>
+              <w:rPr>
+                <w:sz w:val="17"/>
+              </w:rPr>
+              <w:t>unit/property 测试覆盖纯函数</w:t>
+            </w:r>
+          </w:p>
+        </w:tc>
+      </w:tr>
+      <w:tr>
+        <w:tc>
+          <w:tcPr>
+            <w:tcW w:type="dxa" w:w="1949"/>
+          </w:tcPr>
+          <w:p>
+            <w:pPr>
+              <w:spacing w:after="0"/>
+            </w:pPr>
+            <w:r>
+              <w:rPr>
+                <w:sz w:val="17"/>
+              </w:rPr>
+              <w:t>A2</w:t>
+            </w:r>
+          </w:p>
+        </w:tc>
+        <w:tc>
+          <w:tcPr>
+            <w:tcW w:type="dxa" w:w="1949"/>
+          </w:tcPr>
+          <w:p>
+            <w:pPr>
+              <w:spacing w:after="0"/>
+            </w:pPr>
+            <w:r>
+              <w:rPr>
+                <w:sz w:val="17"/>
+              </w:rPr>
+              <w:t>架构师</w:t>
+            </w:r>
+          </w:p>
+        </w:tc>
+        <w:tc>
+          <w:tcPr>
+            <w:tcW w:type="dxa" w:w="1949"/>
+          </w:tcPr>
+          <w:p>
+            <w:pPr>
+              <w:spacing w:after="0"/>
+            </w:pPr>
+            <w:r>
+              <w:rPr>
+                <w:sz w:val="17"/>
+              </w:rPr>
+              <w:t>High</w:t>
+            </w:r>
+          </w:p>
+        </w:tc>
+        <w:tc>
+          <w:tcPr>
+            <w:tcW w:type="dxa" w:w="1949"/>
+          </w:tcPr>
+          <w:p>
+            <w:pPr>
+              <w:spacing w:after="0"/>
+            </w:pPr>
+            <w:r>
+              <w:rPr>
+                <w:sz w:val="17"/>
+              </w:rPr>
+              <w:t>采纳</w:t>
+            </w:r>
+          </w:p>
+        </w:tc>
+        <w:tc>
+          <w:tcPr>
+            <w:tcW w:type="dxa" w:w="1949"/>
+          </w:tcPr>
+          <w:p>
+            <w:pPr>
+              <w:spacing w:after="0"/>
+            </w:pPr>
+            <w:r>
+              <w:rPr>
+                <w:sz w:val="17"/>
+              </w:rPr>
+              <w:t>ValidationError 统一结构</w:t>
+            </w:r>
+          </w:p>
+        </w:tc>
+      </w:tr>
+      <w:tr>
+        <w:tc>
+          <w:tcPr>
+            <w:tcW w:type="dxa" w:w="1949"/>
+          </w:tcPr>
+          <w:p>
+            <w:pPr>
+              <w:spacing w:after="0"/>
+            </w:pPr>
+            <w:r>
+              <w:rPr>
+                <w:sz w:val="17"/>
+              </w:rPr>
+              <w:t>A3</w:t>
+            </w:r>
+          </w:p>
+        </w:tc>
+        <w:tc>
+          <w:tcPr>
+            <w:tcW w:type="dxa" w:w="1949"/>
+          </w:tcPr>
+          <w:p>
+            <w:pPr>
+              <w:spacing w:after="0"/>
+            </w:pPr>
+            <w:r>
+              <w:rPr>
+                <w:sz w:val="17"/>
+              </w:rPr>
+              <w:t>架构师</w:t>
+            </w:r>
+          </w:p>
+        </w:tc>
+        <w:tc>
+          <w:tcPr>
+            <w:tcW w:type="dxa" w:w="1949"/>
+          </w:tcPr>
+          <w:p>
+            <w:pPr>
+              <w:spacing w:after="0"/>
+            </w:pPr>
+            <w:r>
+              <w:rPr>
+                <w:sz w:val="17"/>
+              </w:rPr>
+              <w:t>Medium</w:t>
+            </w:r>
+          </w:p>
+        </w:tc>
+        <w:tc>
+          <w:tcPr>
+            <w:tcW w:type="dxa" w:w="1949"/>
+          </w:tcPr>
+          <w:p>
+            <w:pPr>
+              <w:spacing w:after="0"/>
+            </w:pPr>
+            <w:r>
+              <w:rPr>
+                <w:sz w:val="17"/>
+              </w:rPr>
+              <w:t>部分采纳</w:t>
+            </w:r>
+          </w:p>
+        </w:tc>
+        <w:tc>
+          <w:tcPr>
+            <w:tcW w:type="dxa" w:w="1949"/>
+          </w:tcPr>
+          <w:p>
+            <w:pPr>
+              <w:spacing w:after="0"/>
+            </w:pPr>
+            <w:r>
+              <w:rPr>
+                <w:sz w:val="17"/>
+              </w:rPr>
+              <w:t>contract error_schema</w:t>
+            </w:r>
+          </w:p>
+        </w:tc>
+      </w:tr>
+      <w:tr>
+        <w:tc>
+          <w:tcPr>
+            <w:tcW w:type="dxa" w:w="1949"/>
+          </w:tcPr>
+          <w:p>
+            <w:pPr>
+              <w:spacing w:after="0"/>
+            </w:pPr>
+            <w:r>
+              <w:rPr>
+                <w:sz w:val="17"/>
+              </w:rPr>
+              <w:t>A4</w:t>
+            </w:r>
+          </w:p>
+        </w:tc>
+        <w:tc>
+          <w:tcPr>
+            <w:tcW w:type="dxa" w:w="1949"/>
+          </w:tcPr>
+          <w:p>
+            <w:pPr>
+              <w:spacing w:after="0"/>
+            </w:pPr>
+            <w:r>
+              <w:rPr>
+                <w:sz w:val="17"/>
+              </w:rPr>
+              <w:t>架构师</w:t>
+            </w:r>
+          </w:p>
+        </w:tc>
+        <w:tc>
+          <w:tcPr>
+            <w:tcW w:type="dxa" w:w="1949"/>
+          </w:tcPr>
+          <w:p>
+            <w:pPr>
+              <w:spacing w:after="0"/>
+            </w:pPr>
+            <w:r>
+              <w:rPr>
+                <w:sz w:val="17"/>
+              </w:rPr>
+              <w:t>Medium</w:t>
+            </w:r>
+          </w:p>
+        </w:tc>
+        <w:tc>
+          <w:tcPr>
+            <w:tcW w:type="dxa" w:w="1949"/>
+          </w:tcPr>
+          <w:p>
+            <w:pPr>
+              <w:spacing w:after="0"/>
+            </w:pPr>
+            <w:r>
+              <w:rPr>
+                <w:sz w:val="17"/>
+              </w:rPr>
+              <w:t>采纳</w:t>
+            </w:r>
+          </w:p>
+        </w:tc>
+        <w:tc>
+          <w:tcPr>
+            <w:tcW w:type="dxa" w:w="1949"/>
+          </w:tcPr>
+          <w:p>
+            <w:pPr>
+              <w:spacing w:after="0"/>
+            </w:pPr>
+            <w:r>
+              <w:rPr>
+                <w:sz w:val="17"/>
+              </w:rPr>
+              <w:t>tools/run_tests.py 与报告解耦</w:t>
+            </w:r>
+          </w:p>
+        </w:tc>
+      </w:tr>
+      <w:tr>
+        <w:tc>
+          <w:tcPr>
+            <w:tcW w:type="dxa" w:w="1949"/>
+          </w:tcPr>
+          <w:p>
+            <w:pPr>
+              <w:spacing w:after="0"/>
+            </w:pPr>
+            <w:r>
+              <w:rPr>
+                <w:sz w:val="17"/>
+              </w:rPr>
+              <w:t>A5</w:t>
+            </w:r>
+          </w:p>
+        </w:tc>
+        <w:tc>
+          <w:tcPr>
+            <w:tcW w:type="dxa" w:w="1949"/>
+          </w:tcPr>
+          <w:p>
+            <w:pPr>
+              <w:spacing w:after="0"/>
+            </w:pPr>
+            <w:r>
+              <w:rPr>
+                <w:sz w:val="17"/>
+              </w:rPr>
+              <w:t>架构师</w:t>
+            </w:r>
+          </w:p>
+        </w:tc>
+        <w:tc>
+          <w:tcPr>
+            <w:tcW w:type="dxa" w:w="1949"/>
+          </w:tcPr>
+          <w:p>
+            <w:pPr>
+              <w:spacing w:after="0"/>
+            </w:pPr>
+            <w:r>
+              <w:rPr>
+                <w:sz w:val="17"/>
+              </w:rPr>
+              <w:t>High</w:t>
+            </w:r>
+          </w:p>
+        </w:tc>
+        <w:tc>
+          <w:tcPr>
+            <w:tcW w:type="dxa" w:w="1949"/>
+          </w:tcPr>
+          <w:p>
+            <w:pPr>
+              <w:spacing w:after="0"/>
+            </w:pPr>
+            <w:r>
+              <w:rPr>
+                <w:sz w:val="17"/>
+              </w:rPr>
+              <w:t>采纳</w:t>
+            </w:r>
+          </w:p>
+        </w:tc>
+        <w:tc>
+          <w:tcPr>
+            <w:tcW w:type="dxa" w:w="1949"/>
+          </w:tcPr>
+          <w:p>
+            <w:pPr>
+              <w:spacing w:after="0"/>
+            </w:pPr>
+            <w:r>
+              <w:rPr>
+                <w:sz w:val="17"/>
+              </w:rPr>
+              <w:t>D4-2/D4-8 追溯</w:t>
+            </w:r>
+          </w:p>
+        </w:tc>
+      </w:tr>
+      <w:tr>
+        <w:tc>
+          <w:tcPr>
+            <w:tcW w:type="dxa" w:w="1949"/>
+          </w:tcPr>
+          <w:p>
+            <w:pPr>
+              <w:spacing w:after="0"/>
+            </w:pPr>
+            <w:r>
+              <w:rPr>
+                <w:sz w:val="17"/>
+              </w:rPr>
+              <w:t>A6</w:t>
+            </w:r>
+          </w:p>
+        </w:tc>
+        <w:tc>
+          <w:tcPr>
+            <w:tcW w:type="dxa" w:w="1949"/>
+          </w:tcPr>
+          <w:p>
+            <w:pPr>
+              <w:spacing w:after="0"/>
+            </w:pPr>
+            <w:r>
+              <w:rPr>
+                <w:sz w:val="17"/>
+              </w:rPr>
+              <w:t>架构师</w:t>
+            </w:r>
+          </w:p>
+        </w:tc>
+        <w:tc>
+          <w:tcPr>
+            <w:tcW w:type="dxa" w:w="1949"/>
+          </w:tcPr>
+          <w:p>
+            <w:pPr>
+              <w:spacing w:after="0"/>
+            </w:pPr>
+            <w:r>
+              <w:rPr>
+                <w:sz w:val="17"/>
+              </w:rPr>
+              <w:t>Medium</w:t>
+            </w:r>
+          </w:p>
+        </w:tc>
+        <w:tc>
+          <w:tcPr>
+            <w:tcW w:type="dxa" w:w="1949"/>
+          </w:tcPr>
+          <w:p>
+            <w:pPr>
+              <w:spacing w:after="0"/>
+            </w:pPr>
+            <w:r>
+              <w:rPr>
+                <w:sz w:val="17"/>
+              </w:rPr>
+              <w:t>采纳</w:t>
+            </w:r>
+          </w:p>
+        </w:tc>
+        <w:tc>
+          <w:tcPr>
+            <w:tcW w:type="dxa" w:w="1949"/>
+          </w:tcPr>
+          <w:p>
+            <w:pPr>
+              <w:spacing w:after="0"/>
+            </w:pPr>
+            <w:r>
+              <w:rPr>
+                <w:sz w:val="17"/>
+              </w:rPr>
+              <w:t>reports/test-results.json</w:t>
+            </w:r>
+          </w:p>
+        </w:tc>
+      </w:tr>
+      <w:tr>
+        <w:tc>
+          <w:tcPr>
+            <w:tcW w:type="dxa" w:w="1949"/>
+          </w:tcPr>
+          <w:p>
+            <w:pPr>
+              <w:spacing w:after="0"/>
+            </w:pPr>
+            <w:r>
+              <w:rPr>
+                <w:sz w:val="17"/>
+              </w:rPr>
+              <w:t>S1</w:t>
+            </w:r>
+          </w:p>
+        </w:tc>
+        <w:tc>
+          <w:tcPr>
+            <w:tcW w:type="dxa" w:w="1949"/>
+          </w:tcPr>
+          <w:p>
+            <w:pPr>
+              <w:spacing w:after="0"/>
+            </w:pPr>
+            <w:r>
+              <w:rPr>
+                <w:sz w:val="17"/>
+              </w:rPr>
+              <w:t>安全专家</w:t>
+            </w:r>
+          </w:p>
+        </w:tc>
+        <w:tc>
+          <w:tcPr>
+            <w:tcW w:type="dxa" w:w="1949"/>
+          </w:tcPr>
+          <w:p>
+            <w:pPr>
+              <w:spacing w:after="0"/>
+            </w:pPr>
+            <w:r>
+              <w:rPr>
+                <w:sz w:val="17"/>
+              </w:rPr>
+              <w:t>High</w:t>
+            </w:r>
+          </w:p>
+        </w:tc>
+        <w:tc>
+          <w:tcPr>
+            <w:tcW w:type="dxa" w:w="1949"/>
+          </w:tcPr>
+          <w:p>
+            <w:pPr>
+              <w:spacing w:after="0"/>
+            </w:pPr>
+            <w:r>
+              <w:rPr>
+                <w:sz w:val="17"/>
+              </w:rPr>
+              <w:t>采纳</w:t>
+            </w:r>
+          </w:p>
+        </w:tc>
+        <w:tc>
+          <w:tcPr>
+            <w:tcW w:type="dxa" w:w="1949"/>
+          </w:tcPr>
+          <w:p>
+            <w:pPr>
+              <w:spacing w:after="0"/>
+            </w:pPr>
+            <w:r>
+              <w:rPr>
+                <w:sz w:val="17"/>
+              </w:rPr>
+              <w:t>mask_phone/sanitize_note</w:t>
+            </w:r>
+          </w:p>
+        </w:tc>
+      </w:tr>
+      <w:tr>
+        <w:tc>
+          <w:tcPr>
+            <w:tcW w:type="dxa" w:w="1949"/>
+          </w:tcPr>
+          <w:p>
+            <w:pPr>
+              <w:spacing w:after="0"/>
+            </w:pPr>
+            <w:r>
+              <w:rPr>
+                <w:sz w:val="17"/>
+              </w:rPr>
+              <w:t>S2</w:t>
+            </w:r>
+          </w:p>
+        </w:tc>
+        <w:tc>
+          <w:tcPr>
+            <w:tcW w:type="dxa" w:w="1949"/>
+          </w:tcPr>
+          <w:p>
+            <w:pPr>
+              <w:spacing w:after="0"/>
+            </w:pPr>
+            <w:r>
+              <w:rPr>
+                <w:sz w:val="17"/>
+              </w:rPr>
+              <w:t>安全专家</w:t>
+            </w:r>
+          </w:p>
+        </w:tc>
+        <w:tc>
+          <w:tcPr>
+            <w:tcW w:type="dxa" w:w="1949"/>
+          </w:tcPr>
+          <w:p>
+            <w:pPr>
+              <w:spacing w:after="0"/>
+            </w:pPr>
+            <w:r>
+              <w:rPr>
+                <w:sz w:val="17"/>
+              </w:rPr>
+              <w:t>Medium</w:t>
+            </w:r>
+          </w:p>
+        </w:tc>
+        <w:tc>
+          <w:tcPr>
+            <w:tcW w:type="dxa" w:w="1949"/>
+          </w:tcPr>
+          <w:p>
+            <w:pPr>
+              <w:spacing w:after="0"/>
+            </w:pPr>
+            <w:r>
+              <w:rPr>
+                <w:sz w:val="17"/>
+              </w:rPr>
+              <w:t>部分采纳</w:t>
+            </w:r>
+          </w:p>
+        </w:tc>
+        <w:tc>
+          <w:tcPr>
+            <w:tcW w:type="dxa" w:w="1949"/>
+          </w:tcPr>
+          <w:p>
+            <w:pPr>
+              <w:spacing w:after="0"/>
+            </w:pPr>
+            <w:r>
+              <w:rPr>
+                <w:sz w:val="17"/>
+              </w:rPr>
+              <w:t>D4-4 ZAP 摘要</w:t>
+            </w:r>
+          </w:p>
+        </w:tc>
+      </w:tr>
+      <w:tr>
+        <w:tc>
+          <w:tcPr>
+            <w:tcW w:type="dxa" w:w="1949"/>
+          </w:tcPr>
+          <w:p>
+            <w:pPr>
+              <w:spacing w:after="0"/>
+            </w:pPr>
+            <w:r>
+              <w:rPr>
+                <w:sz w:val="17"/>
+              </w:rPr>
+              <w:t>S3</w:t>
+            </w:r>
+          </w:p>
+        </w:tc>
+        <w:tc>
+          <w:tcPr>
+            <w:tcW w:type="dxa" w:w="1949"/>
+          </w:tcPr>
+          <w:p>
+            <w:pPr>
+              <w:spacing w:after="0"/>
+            </w:pPr>
+            <w:r>
+              <w:rPr>
+                <w:sz w:val="17"/>
+              </w:rPr>
+              <w:t>安全专家</w:t>
+            </w:r>
+          </w:p>
+        </w:tc>
+        <w:tc>
+          <w:tcPr>
+            <w:tcW w:type="dxa" w:w="1949"/>
+          </w:tcPr>
+          <w:p>
+            <w:pPr>
+              <w:spacing w:after="0"/>
+            </w:pPr>
+            <w:r>
+              <w:rPr>
+                <w:sz w:val="17"/>
+              </w:rPr>
+              <w:t>High</w:t>
+            </w:r>
+          </w:p>
+        </w:tc>
+        <w:tc>
+          <w:tcPr>
+            <w:tcW w:type="dxa" w:w="1949"/>
+          </w:tcPr>
+          <w:p>
+            <w:pPr>
+              <w:spacing w:after="0"/>
+            </w:pPr>
+            <w:r>
+              <w:rPr>
+                <w:sz w:val="17"/>
+              </w:rPr>
+              <w:t>采纳</w:t>
+            </w:r>
+          </w:p>
+        </w:tc>
+        <w:tc>
+          <w:tcPr>
+            <w:tcW w:type="dxa" w:w="1949"/>
+          </w:tcPr>
+          <w:p>
+            <w:pPr>
+              <w:spacing w:after="0"/>
+            </w:pPr>
+            <w:r>
+              <w:rPr>
+                <w:sz w:val="17"/>
+              </w:rPr>
+              <w:t>D4-1 数据策略</w:t>
+            </w:r>
+          </w:p>
+        </w:tc>
+      </w:tr>
+      <w:tr>
+        <w:tc>
+          <w:tcPr>
+            <w:tcW w:type="dxa" w:w="1949"/>
+          </w:tcPr>
+          <w:p>
+            <w:pPr>
+              <w:spacing w:after="0"/>
+            </w:pPr>
+            <w:r>
+              <w:rPr>
+                <w:sz w:val="17"/>
+              </w:rPr>
+              <w:t>S4</w:t>
+            </w:r>
+          </w:p>
+        </w:tc>
+        <w:tc>
+          <w:tcPr>
+            <w:tcW w:type="dxa" w:w="1949"/>
+          </w:tcPr>
+          <w:p>
+            <w:pPr>
+              <w:spacing w:after="0"/>
+            </w:pPr>
+            <w:r>
+              <w:rPr>
+                <w:sz w:val="17"/>
+              </w:rPr>
+              <w:t>安全专家</w:t>
+            </w:r>
+          </w:p>
+        </w:tc>
+        <w:tc>
+          <w:tcPr>
+            <w:tcW w:type="dxa" w:w="1949"/>
+          </w:tcPr>
+          <w:p>
+            <w:pPr>
+              <w:spacing w:after="0"/>
+            </w:pPr>
+            <w:r>
+              <w:rPr>
+                <w:sz w:val="17"/>
+              </w:rPr>
+              <w:t>Medium</w:t>
+            </w:r>
+          </w:p>
+        </w:tc>
+        <w:tc>
+          <w:tcPr>
+            <w:tcW w:type="dxa" w:w="1949"/>
+          </w:tcPr>
+          <w:p>
+            <w:pPr>
+              <w:spacing w:after="0"/>
+            </w:pPr>
+            <w:r>
+              <w:rPr>
+                <w:sz w:val="17"/>
+              </w:rPr>
+              <w:t>采纳</w:t>
+            </w:r>
+          </w:p>
+        </w:tc>
+        <w:tc>
+          <w:tcPr>
+            <w:tcW w:type="dxa" w:w="1949"/>
+          </w:tcPr>
+          <w:p>
+            <w:pPr>
+              <w:spacing w:after="0"/>
+            </w:pPr>
+            <w:r>
+              <w:rPr>
+                <w:sz w:val="17"/>
+              </w:rPr>
+              <w:t>D4-4 镜像/扫描门禁</w:t>
+            </w:r>
+          </w:p>
+        </w:tc>
+      </w:tr>
+      <w:tr>
+        <w:tc>
+          <w:tcPr>
+            <w:tcW w:type="dxa" w:w="1949"/>
+          </w:tcPr>
+          <w:p>
+            <w:pPr>
+              <w:spacing w:after="0"/>
+            </w:pPr>
+            <w:r>
+              <w:rPr>
+                <w:sz w:val="17"/>
+              </w:rPr>
+              <w:t>S5</w:t>
+            </w:r>
+          </w:p>
+        </w:tc>
+        <w:tc>
+          <w:tcPr>
+            <w:tcW w:type="dxa" w:w="1949"/>
+          </w:tcPr>
+          <w:p>
+            <w:pPr>
+              <w:spacing w:after="0"/>
+            </w:pPr>
+            <w:r>
+              <w:rPr>
+                <w:sz w:val="17"/>
+              </w:rPr>
+              <w:t>安全专家</w:t>
+            </w:r>
+          </w:p>
+        </w:tc>
+        <w:tc>
+          <w:tcPr>
+            <w:tcW w:type="dxa" w:w="1949"/>
+          </w:tcPr>
+          <w:p>
+            <w:pPr>
+              <w:spacing w:after="0"/>
+            </w:pPr>
+            <w:r>
+              <w:rPr>
+                <w:sz w:val="17"/>
+              </w:rPr>
+              <w:t>Medium</w:t>
+            </w:r>
+          </w:p>
+        </w:tc>
+        <w:tc>
+          <w:tcPr>
+            <w:tcW w:type="dxa" w:w="1949"/>
+          </w:tcPr>
+          <w:p>
+            <w:pPr>
+              <w:spacing w:after="0"/>
+            </w:pPr>
+            <w:r>
+              <w:rPr>
+                <w:sz w:val="17"/>
+              </w:rPr>
+              <w:t>采纳</w:t>
+            </w:r>
+          </w:p>
+        </w:tc>
+        <w:tc>
+          <w:tcPr>
+            <w:tcW w:type="dxa" w:w="1949"/>
+          </w:tcPr>
+          <w:p>
+            <w:pPr>
+              <w:spacing w:after="0"/>
+            </w:pPr>
+            <w:r>
+              <w:rPr>
+                <w:sz w:val="17"/>
+              </w:rPr>
+              <w:t>脱敏对话摘要</w:t>
+            </w:r>
+          </w:p>
+        </w:tc>
+      </w:tr>
+      <w:tr>
+        <w:tc>
+          <w:tcPr>
+            <w:tcW w:type="dxa" w:w="1949"/>
+          </w:tcPr>
+          <w:p>
+            <w:pPr>
+              <w:spacing w:after="0"/>
+            </w:pPr>
+            <w:r>
+              <w:rPr>
+                <w:sz w:val="17"/>
+              </w:rPr>
+              <w:t>S6</w:t>
+            </w:r>
+          </w:p>
+        </w:tc>
+        <w:tc>
+          <w:tcPr>
+            <w:tcW w:type="dxa" w:w="1949"/>
+          </w:tcPr>
+          <w:p>
+            <w:pPr>
+              <w:spacing w:after="0"/>
+            </w:pPr>
+            <w:r>
+              <w:rPr>
+                <w:sz w:val="17"/>
+              </w:rPr>
+              <w:t>安全专家</w:t>
+            </w:r>
+          </w:p>
+        </w:tc>
+        <w:tc>
+          <w:tcPr>
+            <w:tcW w:type="dxa" w:w="1949"/>
+          </w:tcPr>
+          <w:p>
+            <w:pPr>
+              <w:spacing w:after="0"/>
+            </w:pPr>
+            <w:r>
+              <w:rPr>
+                <w:sz w:val="17"/>
+              </w:rPr>
+              <w:t>Low</w:t>
+            </w:r>
+          </w:p>
+        </w:tc>
+        <w:tc>
+          <w:tcPr>
+            <w:tcW w:type="dxa" w:w="1949"/>
+          </w:tcPr>
+          <w:p>
+            <w:pPr>
+              <w:spacing w:after="0"/>
+            </w:pPr>
+            <w:r>
+              <w:rPr>
+                <w:sz w:val="17"/>
+              </w:rPr>
+              <w:t>拒绝</w:t>
+            </w:r>
+          </w:p>
+        </w:tc>
+        <w:tc>
+          <w:tcPr>
+            <w:tcW w:type="dxa" w:w="1949"/>
+          </w:tcPr>
+          <w:p>
+            <w:pPr>
+              <w:spacing w:after="0"/>
+            </w:pPr>
+            <w:r>
+              <w:rPr>
+                <w:sz w:val="17"/>
+              </w:rPr>
+              <w:t>超出课程 PoC 范围</w:t>
+            </w:r>
+          </w:p>
+        </w:tc>
+      </w:tr>
+      <w:tr>
+        <w:tc>
+          <w:tcPr>
+            <w:tcW w:type="dxa" w:w="1949"/>
+          </w:tcPr>
+          <w:p>
+            <w:pPr>
+              <w:spacing w:after="0"/>
+            </w:pPr>
+            <w:r>
+              <w:rPr>
+                <w:sz w:val="17"/>
+              </w:rPr>
+              <w:t>P1</w:t>
+            </w:r>
+          </w:p>
+        </w:tc>
+        <w:tc>
+          <w:tcPr>
+            <w:tcW w:type="dxa" w:w="1949"/>
+          </w:tcPr>
+          <w:p>
+            <w:pPr>
+              <w:spacing w:after="0"/>
+            </w:pPr>
+            <w:r>
+              <w:rPr>
+                <w:sz w:val="17"/>
+              </w:rPr>
+              <w:t>性能工程师</w:t>
+            </w:r>
+          </w:p>
+        </w:tc>
+        <w:tc>
+          <w:tcPr>
+            <w:tcW w:type="dxa" w:w="1949"/>
+          </w:tcPr>
+          <w:p>
+            <w:pPr>
+              <w:spacing w:after="0"/>
+            </w:pPr>
+            <w:r>
+              <w:rPr>
+                <w:sz w:val="17"/>
+              </w:rPr>
+              <w:t>High</w:t>
+            </w:r>
+          </w:p>
+        </w:tc>
+        <w:tc>
+          <w:tcPr>
+            <w:tcW w:type="dxa" w:w="1949"/>
+          </w:tcPr>
+          <w:p>
+            <w:pPr>
+              <w:spacing w:after="0"/>
+            </w:pPr>
+            <w:r>
+              <w:rPr>
+                <w:sz w:val="17"/>
+              </w:rPr>
+              <w:t>采纳</w:t>
+            </w:r>
+          </w:p>
+        </w:tc>
+        <w:tc>
+          <w:tcPr>
+            <w:tcW w:type="dxa" w:w="1949"/>
+          </w:tcPr>
+          <w:p>
+            <w:pPr>
+              <w:spacing w:after="0"/>
+            </w:pPr>
+            <w:r>
+              <w:rPr>
+                <w:sz w:val="17"/>
+              </w:rPr>
+              <w:t>容量/时段属性测试</w:t>
+            </w:r>
+          </w:p>
+        </w:tc>
+      </w:tr>
+      <w:tr>
+        <w:tc>
+          <w:tcPr>
+            <w:tcW w:type="dxa" w:w="1949"/>
+          </w:tcPr>
+          <w:p>
+            <w:pPr>
+              <w:spacing w:after="0"/>
+            </w:pPr>
+            <w:r>
+              <w:rPr>
+                <w:sz w:val="17"/>
+              </w:rPr>
+              <w:t>P2</w:t>
+            </w:r>
+          </w:p>
+        </w:tc>
+        <w:tc>
+          <w:tcPr>
+            <w:tcW w:type="dxa" w:w="1949"/>
+          </w:tcPr>
+          <w:p>
+            <w:pPr>
+              <w:spacing w:after="0"/>
+            </w:pPr>
+            <w:r>
+              <w:rPr>
+                <w:sz w:val="17"/>
+              </w:rPr>
+              <w:t>性能工程师</w:t>
+            </w:r>
+          </w:p>
+        </w:tc>
+        <w:tc>
+          <w:tcPr>
+            <w:tcW w:type="dxa" w:w="1949"/>
+          </w:tcPr>
+          <w:p>
+            <w:pPr>
+              <w:spacing w:after="0"/>
+            </w:pPr>
+            <w:r>
+              <w:rPr>
+                <w:sz w:val="17"/>
+              </w:rPr>
+              <w:t>High</w:t>
+            </w:r>
+          </w:p>
+        </w:tc>
+        <w:tc>
+          <w:tcPr>
+            <w:tcW w:type="dxa" w:w="1949"/>
+          </w:tcPr>
+          <w:p>
+            <w:pPr>
+              <w:spacing w:after="0"/>
+            </w:pPr>
+            <w:r>
+              <w:rPr>
+                <w:sz w:val="17"/>
+              </w:rPr>
+              <w:t>部分采纳</w:t>
+            </w:r>
+          </w:p>
+        </w:tc>
+        <w:tc>
+          <w:tcPr>
+            <w:tcW w:type="dxa" w:w="1949"/>
+          </w:tcPr>
+          <w:p>
+            <w:pPr>
+              <w:spacing w:after="0"/>
+            </w:pPr>
+            <w:r>
+              <w:rPr>
+                <w:sz w:val="17"/>
+              </w:rPr>
+              <w:t>稳定 reservation_id</w:t>
+            </w:r>
+          </w:p>
+        </w:tc>
+      </w:tr>
+      <w:tr>
+        <w:tc>
+          <w:tcPr>
+            <w:tcW w:type="dxa" w:w="1949"/>
+          </w:tcPr>
+          <w:p>
+            <w:pPr>
+              <w:spacing w:after="0"/>
+            </w:pPr>
+            <w:r>
+              <w:rPr>
+                <w:sz w:val="17"/>
+              </w:rPr>
+              <w:t>P3</w:t>
+            </w:r>
+          </w:p>
+        </w:tc>
+        <w:tc>
+          <w:tcPr>
+            <w:tcW w:type="dxa" w:w="1949"/>
+          </w:tcPr>
+          <w:p>
+            <w:pPr>
+              <w:spacing w:after="0"/>
+            </w:pPr>
+            <w:r>
+              <w:rPr>
+                <w:sz w:val="17"/>
+              </w:rPr>
+              <w:t>性能工程师</w:t>
+            </w:r>
+          </w:p>
+        </w:tc>
+        <w:tc>
+          <w:tcPr>
+            <w:tcW w:type="dxa" w:w="1949"/>
+          </w:tcPr>
+          <w:p>
+            <w:pPr>
+              <w:spacing w:after="0"/>
+            </w:pPr>
+            <w:r>
+              <w:rPr>
+                <w:sz w:val="17"/>
+              </w:rPr>
+              <w:t>Medium</w:t>
+            </w:r>
+          </w:p>
+        </w:tc>
+        <w:tc>
+          <w:tcPr>
+            <w:tcW w:type="dxa" w:w="1949"/>
+          </w:tcPr>
+          <w:p>
+            <w:pPr>
+              <w:spacing w:after="0"/>
+            </w:pPr>
+            <w:r>
+              <w:rPr>
+                <w:sz w:val="17"/>
+              </w:rPr>
+              <w:t>采纳</w:t>
+            </w:r>
+          </w:p>
+        </w:tc>
+        <w:tc>
+          <w:tcPr>
+            <w:tcW w:type="dxa" w:w="1949"/>
+          </w:tcPr>
+          <w:p>
+            <w:pPr>
+              <w:spacing w:after="0"/>
+            </w:pPr>
+            <w:r>
+              <w:rPr>
+                <w:sz w:val="17"/>
+              </w:rPr>
+              <w:t>D4-4 k6 阈值</w:t>
+            </w:r>
+          </w:p>
+        </w:tc>
+      </w:tr>
+      <w:tr>
+        <w:tc>
+          <w:tcPr>
+            <w:tcW w:type="dxa" w:w="1949"/>
+          </w:tcPr>
+          <w:p>
+            <w:pPr>
+              <w:spacing w:after="0"/>
+            </w:pPr>
+            <w:r>
+              <w:rPr>
+                <w:sz w:val="17"/>
+              </w:rPr>
+              <w:t>P4</w:t>
+            </w:r>
+          </w:p>
+        </w:tc>
+        <w:tc>
+          <w:tcPr>
+            <w:tcW w:type="dxa" w:w="1949"/>
+          </w:tcPr>
+          <w:p>
+            <w:pPr>
+              <w:spacing w:after="0"/>
+            </w:pPr>
+            <w:r>
+              <w:rPr>
+                <w:sz w:val="17"/>
+              </w:rPr>
+              <w:t>性能工程师</w:t>
+            </w:r>
+          </w:p>
+        </w:tc>
+        <w:tc>
+          <w:tcPr>
+            <w:tcW w:type="dxa" w:w="1949"/>
+          </w:tcPr>
+          <w:p>
+            <w:pPr>
+              <w:spacing w:after="0"/>
+            </w:pPr>
+            <w:r>
+              <w:rPr>
+                <w:sz w:val="17"/>
+              </w:rPr>
+              <w:t>Medium</w:t>
+            </w:r>
+          </w:p>
+        </w:tc>
+        <w:tc>
+          <w:tcPr>
+            <w:tcW w:type="dxa" w:w="1949"/>
+          </w:tcPr>
+          <w:p>
+            <w:pPr>
+              <w:spacing w:after="0"/>
+            </w:pPr>
+            <w:r>
+              <w:rPr>
+                <w:sz w:val="17"/>
+              </w:rPr>
+              <w:t>采纳</w:t>
+            </w:r>
+          </w:p>
+        </w:tc>
+        <w:tc>
+          <w:tcPr>
+            <w:tcW w:type="dxa" w:w="1949"/>
+          </w:tcPr>
+          <w:p>
+            <w:pPr>
+              <w:spacing w:after="0"/>
+            </w:pPr>
+            <w:r>
+              <w:rPr>
+                <w:sz w:val="17"/>
+              </w:rPr>
+              <w:t>D4-1 分层门禁</w:t>
+            </w:r>
+          </w:p>
+        </w:tc>
+      </w:tr>
+      <w:tr>
+        <w:tc>
+          <w:tcPr>
+            <w:tcW w:type="dxa" w:w="1949"/>
+          </w:tcPr>
+          <w:p>
+            <w:pPr>
+              <w:spacing w:after="0"/>
+            </w:pPr>
+            <w:r>
+              <w:rPr>
+                <w:sz w:val="17"/>
+              </w:rPr>
+              <w:t>P5</w:t>
+            </w:r>
+          </w:p>
+        </w:tc>
+        <w:tc>
+          <w:tcPr>
+            <w:tcW w:type="dxa" w:w="1949"/>
+          </w:tcPr>
+          <w:p>
+            <w:pPr>
+              <w:spacing w:after="0"/>
+            </w:pPr>
+            <w:r>
+              <w:rPr>
+                <w:sz w:val="17"/>
+              </w:rPr>
+              <w:t>性能工程师</w:t>
+            </w:r>
+          </w:p>
+        </w:tc>
+        <w:tc>
+          <w:tcPr>
+            <w:tcW w:type="dxa" w:w="1949"/>
+          </w:tcPr>
+          <w:p>
+            <w:pPr>
+              <w:spacing w:after="0"/>
+            </w:pPr>
+            <w:r>
+              <w:rPr>
+                <w:sz w:val="17"/>
+              </w:rPr>
+              <w:t>Medium</w:t>
+            </w:r>
+          </w:p>
+        </w:tc>
+        <w:tc>
+          <w:tcPr>
+            <w:tcW w:type="dxa" w:w="1949"/>
+          </w:tcPr>
+          <w:p>
+            <w:pPr>
+              <w:spacing w:after="0"/>
+            </w:pPr>
+            <w:r>
+              <w:rPr>
+                <w:sz w:val="17"/>
+              </w:rPr>
+              <w:t>采纳</w:t>
+            </w:r>
+          </w:p>
+        </w:tc>
+        <w:tc>
+          <w:tcPr>
+            <w:tcW w:type="dxa" w:w="1949"/>
+          </w:tcPr>
+          <w:p>
+            <w:pPr>
+              <w:spacing w:after="0"/>
+            </w:pPr>
+            <w:r>
+              <w:rPr>
+                <w:sz w:val="17"/>
+              </w:rPr>
+              <w:t>D4-4 4xx/5xx 区分</w:t>
+            </w:r>
+          </w:p>
+        </w:tc>
+      </w:tr>
+      <w:tr>
+        <w:tc>
+          <w:tcPr>
+            <w:tcW w:type="dxa" w:w="1949"/>
+          </w:tcPr>
+          <w:p>
+            <w:pPr>
+              <w:spacing w:after="0"/>
+            </w:pPr>
+            <w:r>
+              <w:rPr>
+                <w:sz w:val="17"/>
+              </w:rPr>
+              <w:t>P6</w:t>
+            </w:r>
+          </w:p>
+        </w:tc>
+        <w:tc>
+          <w:tcPr>
+            <w:tcW w:type="dxa" w:w="1949"/>
+          </w:tcPr>
+          <w:p>
+            <w:pPr>
+              <w:spacing w:after="0"/>
+            </w:pPr>
+            <w:r>
+              <w:rPr>
+                <w:sz w:val="17"/>
+              </w:rPr>
+              <w:t>性能工程师</w:t>
+            </w:r>
+          </w:p>
+        </w:tc>
+        <w:tc>
+          <w:tcPr>
+            <w:tcW w:type="dxa" w:w="1949"/>
+          </w:tcPr>
+          <w:p>
+            <w:pPr>
+              <w:spacing w:after="0"/>
+            </w:pPr>
+            <w:r>
+              <w:rPr>
+                <w:sz w:val="17"/>
+              </w:rPr>
+              <w:t>Low</w:t>
+            </w:r>
+          </w:p>
+        </w:tc>
+        <w:tc>
+          <w:tcPr>
+            <w:tcW w:type="dxa" w:w="1949"/>
+          </w:tcPr>
+          <w:p>
+            <w:pPr>
+              <w:spacing w:after="0"/>
+            </w:pPr>
+            <w:r>
+              <w:rPr>
+                <w:sz w:val="17"/>
+              </w:rPr>
+              <w:t>拒绝</w:t>
+            </w:r>
+          </w:p>
+        </w:tc>
+        <w:tc>
+          <w:tcPr>
+            <w:tcW w:type="dxa" w:w="1949"/>
+          </w:tcPr>
+          <w:p>
+            <w:pPr>
+              <w:spacing w:after="0"/>
+            </w:pPr>
+            <w:r>
+              <w:rPr>
+                <w:sz w:val="17"/>
+              </w:rPr>
+              <w:t>与尾延迟目标冲突</w:t>
+            </w:r>
+          </w:p>
+        </w:tc>
+      </w:tr>
+    </w:tbl>
     <w:sectPr>
       <w:pgSz w:w="12240" w:h="15840"/>
       <w:pgMar w:top="1134" w:right="1247" w:bottom="1134" w:left="1247" w:header="720" w:footer="720" w:gutter="0"/>

</xml_diff>